<commit_message>
UPD: plan van aanpak
</commit_message>
<xml_diff>
--- a/Plan_van_Aanpak_Keuzedeel_Bootstrap.docx
+++ b/Plan_van_Aanpak_Keuzedeel_Bootstrap.docx
@@ -56,17 +56,15 @@
     <w:p>
       <w:pPr>
         <w:jc w:val="center"/>
+        <w:rPr>
+          <w:lang w:val="nl-NL"/>
+        </w:rPr>
       </w:pPr>
       <w:r>
-        <w:t xml:space="preserve">Project: </w:t>
-      </w:r>
-      <w:proofErr w:type="spellStart"/>
-      <w:r>
-        <w:t>Klantenbeheer</w:t>
-      </w:r>
-      <w:proofErr w:type="spellEnd"/>
-      <w:r>
-        <w:t xml:space="preserve"> Dashboard</w:t>
+        <w:rPr>
+          <w:lang w:val="nl-NL"/>
+        </w:rPr>
+        <w:t>Project: Klantenbeheer Dashboard</w:t>
       </w:r>
     </w:p>
     <w:tbl>
@@ -222,7 +220,13 @@
           </w:tcPr>
           <w:p>
             <w:r>
-              <w:t>24-09-2026 t/m 21-10-2026</w:t>
+              <w:t>24-09-2026 t/m 2</w:t>
+            </w:r>
+            <w:r>
+              <w:t>0</w:t>
+            </w:r>
+            <w:r>
+              <w:t>-10-2026</w:t>
             </w:r>
           </w:p>
         </w:tc>
@@ -440,7 +444,21 @@
         <w:rPr>
           <w:lang w:val="nl-NL"/>
         </w:rPr>
-        <w:t xml:space="preserve"> met een openbare loginpagina en een Klantenbeheer Dashboard. De loginpagina bevat een korte uitleg over de applicatie, velden voor e-mail en wachtwoord, Inloggen, Wachtwoord vergeten?, Account aanmaken en een Contact-menu. Het dashboard bevat een klantenoverzicht, zoekfunctie en pagina's voor toevoegen, bekijken en wijzigen. Bovenaan staat een begroeting met de gebruikersnaam en een knop Uitloggen. De applicatie werkt op mobiel, tablet en desktop.</w:t>
+        <w:t xml:space="preserve"> met een openbare loginpagina en een Klantenbeheer Dashboard. De loginpagina bevat een korte uitleg over de applicatie, velden voor e-mail en wachtwoord, Inloggen, Wachtwoord </w:t>
+      </w:r>
+      <w:proofErr w:type="gramStart"/>
+      <w:r>
+        <w:rPr>
+          <w:lang w:val="nl-NL"/>
+        </w:rPr>
+        <w:t>vergeten?,</w:t>
+      </w:r>
+      <w:proofErr w:type="gramEnd"/>
+      <w:r>
+        <w:rPr>
+          <w:lang w:val="nl-NL"/>
+        </w:rPr>
+        <w:t xml:space="preserve"> Account aanmaken en een Contact-menu. Het dashboard bevat een klantenoverzicht, zoekfunctie en pagina's voor toevoegen, bekijken en wijzigen. Bovenaan staat een begroeting met de gebruikersnaam en een knop Uitloggen. De applicatie werkt op mobiel, tablet en desktop.</w:t>
       </w:r>
     </w:p>
     <w:p>
@@ -1060,7 +1078,15 @@
       </w:r>
       <w:proofErr w:type="spellEnd"/>
       <w:r>
-        <w:t xml:space="preserve"> responsive gemaakt met Bootstrap.</w:t>
+        <w:t xml:space="preserve"> responsive </w:t>
+      </w:r>
+      <w:proofErr w:type="spellStart"/>
+      <w:r>
+        <w:t>gemaakt</w:t>
+      </w:r>
+      <w:proofErr w:type="spellEnd"/>
+      <w:r>
+        <w:t xml:space="preserve"> met Bootstrap.</w:t>
       </w:r>
     </w:p>
     <w:p>
@@ -1141,6 +1167,7 @@
         <w:t xml:space="preserve">8. </w:t>
       </w:r>
       <w:proofErr w:type="spellStart"/>
+      <w:proofErr w:type="gramStart"/>
       <w:r>
         <w:rPr>
           <w:lang w:val="nl-NL"/>
@@ -1152,7 +1179,14 @@
         <w:rPr>
           <w:lang w:val="nl-NL"/>
         </w:rPr>
-        <w:t xml:space="preserve"> / </w:t>
+        <w:t xml:space="preserve"> /</w:t>
+      </w:r>
+      <w:proofErr w:type="gramEnd"/>
+      <w:r>
+        <w:rPr>
+          <w:lang w:val="nl-NL"/>
+        </w:rPr>
+        <w:t xml:space="preserve"> </w:t>
       </w:r>
       <w:proofErr w:type="spellStart"/>
       <w:r>
@@ -1224,8 +1258,16 @@
         <w:rPr>
           <w:b/>
         </w:rPr>
-        <w:t xml:space="preserve"> loginpagina</w:t>
+        <w:t xml:space="preserve"> </w:t>
       </w:r>
+      <w:proofErr w:type="spellStart"/>
+      <w:r>
+        <w:rPr>
+          <w:b/>
+        </w:rPr>
+        <w:t>loginpagina</w:t>
+      </w:r>
+      <w:proofErr w:type="spellEnd"/>
     </w:p>
     <w:tbl>
       <w:tblPr>
@@ -1379,7 +1421,21 @@
                     <w:rPr>
                       <w:lang w:val="nl-NL"/>
                     </w:rPr>
-                    <w:t>[____________________________]   [oog-icoon]</w:t>
+                    <w:t>[___________________________</w:t>
+                  </w:r>
+                  <w:proofErr w:type="gramStart"/>
+                  <w:r>
+                    <w:rPr>
+                      <w:lang w:val="nl-NL"/>
+                    </w:rPr>
+                    <w:t xml:space="preserve">_]   </w:t>
+                  </w:r>
+                  <w:proofErr w:type="gramEnd"/>
+                  <w:r>
+                    <w:rPr>
+                      <w:lang w:val="nl-NL"/>
+                    </w:rPr>
+                    <w:t>[oog-icoon]</w:t>
                   </w:r>
                 </w:p>
                 <w:p>
@@ -1403,8 +1459,13 @@
                 <w:p/>
                 <w:p>
                   <w:r>
-                    <w:t>[ Inloggen ]</w:t>
+                    <w:t xml:space="preserve">[ </w:t>
                   </w:r>
+                  <w:proofErr w:type="gramStart"/>
+                  <w:r>
+                    <w:t>Inloggen ]</w:t>
+                  </w:r>
+                  <w:proofErr w:type="gramEnd"/>
                 </w:p>
               </w:tc>
               <w:tc>
@@ -1484,6 +1545,7 @@
                     <w:t xml:space="preserve">[ Account </w:t>
                   </w:r>
                   <w:proofErr w:type="spellStart"/>
+                  <w:proofErr w:type="gramStart"/>
                   <w:r>
                     <w:t>aanmaken</w:t>
                   </w:r>
@@ -1491,6 +1553,7 @@
                   <w:r>
                     <w:t xml:space="preserve"> ]</w:t>
                   </w:r>
+                  <w:proofErr w:type="gramEnd"/>
                 </w:p>
               </w:tc>
             </w:tr>
@@ -1694,7 +1757,21 @@
               <w:rPr>
                 <w:lang w:val="nl-NL"/>
               </w:rPr>
-              <w:t>Search: [________________]  [Search]</w:t>
+              <w:t>Search: [_______________</w:t>
+            </w:r>
+            <w:proofErr w:type="gramStart"/>
+            <w:r>
+              <w:rPr>
+                <w:lang w:val="nl-NL"/>
+              </w:rPr>
+              <w:t>_]  [</w:t>
+            </w:r>
+            <w:proofErr w:type="gramEnd"/>
+            <w:r>
+              <w:rPr>
+                <w:lang w:val="nl-NL"/>
+              </w:rPr>
+              <w:t>Search]</w:t>
             </w:r>
           </w:p>
           <w:p>
@@ -1707,8 +1784,30 @@
               <w:rPr>
                 <w:lang w:val="nl-NL"/>
               </w:rPr>
-              <w:t>Welkom, Ali Hassan                     [ Uitloggen ]</w:t>
+              <w:t xml:space="preserve">Welkom, Ali Hassan                  </w:t>
             </w:r>
+            <w:proofErr w:type="gramStart"/>
+            <w:r>
+              <w:rPr>
+                <w:lang w:val="nl-NL"/>
+              </w:rPr>
+              <w:t xml:space="preserve">   [</w:t>
+            </w:r>
+            <w:proofErr w:type="gramEnd"/>
+            <w:r>
+              <w:rPr>
+                <w:lang w:val="nl-NL"/>
+              </w:rPr>
+              <w:t xml:space="preserve"> </w:t>
+            </w:r>
+            <w:proofErr w:type="gramStart"/>
+            <w:r>
+              <w:rPr>
+                <w:lang w:val="nl-NL"/>
+              </w:rPr>
+              <w:t>Uitloggen ]</w:t>
+            </w:r>
+            <w:proofErr w:type="gramEnd"/>
           </w:p>
           <w:p>
             <w:pPr>
@@ -1769,9 +1868,6 @@
     <w:p>
       <w:pPr>
         <w:pStyle w:val="Kop1"/>
-        <w:rPr>
-          <w:lang w:val="nl-NL"/>
-        </w:rPr>
       </w:pPr>
     </w:p>
     <w:sectPr>

</xml_diff>